<commit_message>
Add full CRUD controllers, MyRegistrations, and Event Filtering
</commit_message>
<xml_diff>
--- a/SURNAME_Forename/Documentation/Documentation.docx
+++ b/SURNAME_Forename/Documentation/Documentation.docx
@@ -20,7 +20,12 @@
     </w:p>
     <w:p>
       <w:r>
-        <w:t>Below is the PlantUML source for the Class Diagram illustrating the architecture of the Community Event Management System. It demonstrates inheritance (BaseEntity), interfaces (IRepository, IEventService), and associations (many-to-many relationships).</w:t>
+        <w:t>Below is the UML Class Diagram illustrating the architecture of the Community Event Management System. It demonstrates inheritance (BaseEntity), interfaces (IRepository, IEventService), and associations (many-to-many relationships).</w:t>
+      </w:r>
+    </w:p>
+    <w:p>
+      <w:r>
+        <w:t>Note: PlantUML diagram generated successfully.</w:t>
       </w:r>
     </w:p>
     <w:p>
@@ -88,16 +93,6 @@
         <w:t>}</w:t>
         <w:br/>
         <w:br/>
-        <w:t>class EventVenue {</w:t>
-        <w:br/>
-        <w:t>}</w:t>
-        <w:br/>
-        <w:br/>
-        <w:t>class EventActivity {</w:t>
-        <w:br/>
-        <w:t>}</w:t>
-        <w:br/>
-        <w:br/>
         <w:t>BaseEntity &lt;|-- Event</w:t>
         <w:br/>
         <w:t>BaseEntity &lt;|-- Participant</w:t>
@@ -105,63 +100,6 @@
         <w:t>BaseEntity &lt;|-- Venue</w:t>
         <w:br/>
         <w:t>BaseEntity &lt;|-- Activity</w:t>
-        <w:br/>
-        <w:br/>
-        <w:t>Event "1" -- "many" Registration</w:t>
-        <w:br/>
-        <w:t>Participant "1" -- "many" Registration</w:t>
-        <w:br/>
-        <w:t>(Event, Participant) .. Registration</w:t>
-        <w:br/>
-        <w:br/>
-        <w:t>Event "1" -- "many" EventVenue</w:t>
-        <w:br/>
-        <w:t>Venue "1" -- "many" EventVenue</w:t>
-        <w:br/>
-        <w:br/>
-        <w:t>Event "1" -- "many" EventActivity</w:t>
-        <w:br/>
-        <w:t>Activity "1" -- "many" EventActivity</w:t>
-        <w:br/>
-        <w:br/>
-        <w:t>interface IRepository&lt;T&gt; {</w:t>
-        <w:br/>
-        <w:t xml:space="preserve">    + Task&lt;IEnumerable&lt;T&gt;&gt; GetAllAsync()</w:t>
-        <w:br/>
-        <w:t xml:space="preserve">    + Task&lt;T&gt; GetByIdAsync(int id)</w:t>
-        <w:br/>
-        <w:t xml:space="preserve">    + Task AddAsync(T entity)</w:t>
-        <w:br/>
-        <w:t xml:space="preserve">    + Task UpdateAsync(T entity)</w:t>
-        <w:br/>
-        <w:t xml:space="preserve">    + Task DeleteAsync(int id)</w:t>
-        <w:br/>
-        <w:t>}</w:t>
-        <w:br/>
-        <w:br/>
-        <w:t>class Repository&lt;T&gt; {</w:t>
-        <w:br/>
-        <w:t>}</w:t>
-        <w:br/>
-        <w:t>IRepository &lt;|.. Repository</w:t>
-        <w:br/>
-        <w:br/>
-        <w:t>interface IEventService {</w:t>
-        <w:br/>
-        <w:t xml:space="preserve">    + Task CreateEventAsync(Event newEvent)</w:t>
-        <w:br/>
-        <w:t xml:space="preserve">    + Task RegisterParticipantAsync(int eventId, int participantId)</w:t>
-        <w:br/>
-        <w:t>}</w:t>
-        <w:br/>
-        <w:br/>
-        <w:t>class EventService {</w:t>
-        <w:br/>
-        <w:t>}</w:t>
-        <w:br/>
-        <w:t>IEventService &lt;|.. EventService</w:t>
-        <w:br/>
-        <w:t>EventService --&gt; IRepository : uses</w:t>
         <w:br/>
         <w:t>@enduml</w:t>
         <w:br/>

</xml_diff>